<commit_message>
feat(structure-portal): structure registration with type selection (Mairie, ONG, etc.) and unified access to all waste/report data
</commit_message>
<xml_diff>
--- a/Dossier_Presentation_SalubApp_Complet.docx
+++ b/Dossier_Presentation_SalubApp_Complet.docx
@@ -777,7 +777,7 @@
           <w:rFonts w:ascii="Calibri" w:hAnsi="Calibri"/>
           <w:color w:val="107C41"/>
         </w:rPr>
-        <w:t>4. Fonctionnalités pour les Mairies, Autorités &amp; Administrateurs</w:t>
+        <w:t>4. Portail Unifié pour les Structures (Mairies, ONG, Associations &amp; Opérateurs)</w:t>
       </w:r>
     </w:p>
     <w:p>
@@ -785,7 +785,7 @@
         <w:pStyle w:val="ListBullet"/>
       </w:pPr>
       <w:r>
-        <w:t>Tableau de Bord Autorités (/dashboard) : Interface dédiée aux agents municipaux et services techniques permettant de visualiser l'ensemble des signalements citoyens avec leurs coordonnées GPS exactes.</w:t>
+        <w:t>Inscription Dédiée des Structures (/login?mode=structure) : Toute structure engagée dans l'assainissement peut s'inscrire sur la plateforme en renseignant son nom et en choisissant son type de structure parmi : Mairie / Collectivité locale, ONG / Association citoyenne, Opérateur technique de salubrité, Entreprise privée / Programme RSE, ou Autre institution.</w:t>
       </w:r>
     </w:p>
     <w:p>
@@ -793,7 +793,7 @@
         <w:pStyle w:val="ListBullet"/>
       </w:pPr>
       <w:r>
-        <w:t>Gestion du Cycle de Vie des Interventions : Changement de statut en temps réel (« Nouveau » -&gt; « En cours » -&gt; « Résolu » -&gt; « Rejeté »), immédiatement visible par la population pour renforcer la transparence de l'action municipale.</w:t>
+        <w:t>Accès Unifié et Égalitaire aux Données de Déchets (/dashboard) : Dès son inscription validée, peu importe le type de structure choisi (Mairie, ONG, Association…), l'organisation accède à l'intégralité des mêmes données de déchets et de signalements citoyens à travers toute la ville.</w:t>
       </w:r>
     </w:p>
     <w:p>
@@ -801,7 +801,7 @@
         <w:pStyle w:val="ListBullet"/>
       </w:pPr>
       <w:r>
-        <w:t>Exportation CSV / Excel Géolocalisée : Téléchargement en un clic de la base des signalements (ID, date, catégorie, statut, description, ville/quartier, latitude, longitude, nombre de confirmations) pour intégration dans les outils SIG de la mairie et planification optimale des camions de collecte.</w:t>
+        <w:t>Priorisation Automatique par Score d'Urgence Citoyenne : Chaque signalement reçoit un badge d'urgence automatique (« Urgence Critique », « Priorité Élevée », « Normale ») calculé à partir du nombre de confirmations citoyennes (+1), des votes « Vrai » et des attestations « Encore persistant ».</w:t>
       </w:r>
     </w:p>
     <w:p>
@@ -809,7 +809,31 @@
         <w:pStyle w:val="ListBullet"/>
       </w:pPr>
       <w:r>
-        <w:t>Console de Super-Administration (/administrator_app) : Gestion complète de la plateforme incluant la certification des signalements (« Vérifié », « Douteux », « Rejeté »), la modération des commentaires citoyens, la consultation des avis utilisateurs et l'attribution des rôles (Citoyen, Autorité, Administrateur).</w:t>
+        <w:t>Filtrage par Commune GPS &amp; Recherche de Localité : Les structures peuvent filtrer les données en un clic par commune d'Abidjan (détectée automatiquement via les coordonnées GPS envoyées avec chaque image) ou par catégorie de déchet/nuisance.</w:t>
+      </w:r>
+    </w:p>
+    <w:p>
+      <w:pPr>
+        <w:pStyle w:val="ListBullet"/>
+      </w:pPr>
+      <w:r>
+        <w:t>Bouton « Itinéraire Terrain (Google Maps) » : Sur chaque fiche de signalement, un bouton lance directement la navigation GPS vers le point exact du tas d'ordures ou de la dégradation pour guider les camions de ramassage et les équipes d'intervention.</w:t>
+      </w:r>
+    </w:p>
+    <w:p>
+      <w:pPr>
+        <w:pStyle w:val="ListBullet"/>
+      </w:pPr>
+      <w:r>
+        <w:t>Suivi du Statut d'Intervention &amp; Export CSV/Excel : Mise à jour en temps réel du statut (« Nouveau » -&gt; « En cours » -&gt; « Résolu ») et téléchargement complet de la base de données en CSV/Excel avec coordonnées GPS exactes et niveaux d'urgence.</w:t>
+      </w:r>
+    </w:p>
+    <w:p>
+      <w:pPr>
+        <w:pStyle w:val="ListBullet"/>
+      </w:pPr>
+      <w:r>
+        <w:t>Console de Super-Administration (/administrator_app) : Certification des signalements (« Vérifié », « Douteux », « Rejeté »), modération des commentaires citoyens, consultation des avis utilisateurs et gestion des rôles.</w:t>
       </w:r>
     </w:p>
     <w:p>

</xml_diff>

<commit_message>
docs: update Word candidacy dossier with 4-pillar business model and latest platform features
</commit_message>
<xml_diff>
--- a/Dossier_Presentation_SalubApp_Complet.docx
+++ b/Dossier_Presentation_SalubApp_Complet.docx
@@ -11,7 +11,7 @@
         <w:rPr>
           <w:color w:val="107C41"/>
         </w:rPr>
-        <w:t>DOSSIER DESCRIPTIF COMPLET — SALUBAPP</w:t>
+        <w:t>DOSSIER DE CANDIDATURE &amp; PRÉSENTATION COMPLÈTE — SALUBAPP</w:t>
       </w:r>
     </w:p>
     <w:p>
@@ -26,7 +26,7 @@
         </w:rPr>
         <w:t>Donner le pouvoir aux citoyens pour bâtir ensemble des villes propres :</w:t>
         <w:br/>
-        <w:t>La plateforme citoyenne intelligente qui fait de chaque Ivoirien l'acteur majeur de la salubrité et de l'assainissement de son quartier</w:t>
+        <w:t>La plateforme CivTech &amp; Intelligence Artificielle qui fait de chaque Ivoirien l'acteur majeur de la salubrité et de l'assainissement de son quartier</w:t>
       </w:r>
     </w:p>
     <w:p>
@@ -38,7 +38,9 @@
           <w:i/>
           <w:color w:val="107C41"/>
         </w:rPr>
-        <w:t>Application en production : https://salubapp-l8hz.vercel.app/</w:t>
+        <w:t>Plateforme Citoyenne : https://salubapp-l8hz.vercel.app/</w:t>
+        <w:br/>
+        <w:t>Portail Dédié aux Structures (Mairies, ONG, Opérateurs) : https://salubapp-l8hz.vercel.app/dashboard</w:t>
       </w:r>
     </w:p>
     <w:p>
@@ -58,7 +60,7 @@
           <w:rFonts w:ascii="Calibri" w:hAnsi="Calibri"/>
           <w:color w:val="B45309"/>
         </w:rPr>
-        <w:t>0. PROMPT D'INSTRUCTION POUR GEMINI (À UTILISER POUR VOTRE CANDIDATURE)</w:t>
+        <w:t>0. RÉSUMÉ EXÉCUTIF &amp; INSTRUCTIONS DE CANDIDATURE</w:t>
       </w:r>
     </w:p>
     <w:p>
@@ -66,14 +68,20 @@
         <w:rPr>
           <w:i/>
         </w:rPr>
-        <w:t>Instructions destinées à l'IA (Gemini) :</w:t>
+        <w:t>Note d'instruction (si vous fournissez ce document à une IA comme Gemini pour adapter une réponse à un formulaire) :</w:t>
         <w:br/>
-        <w:t>« Tu es un expert en rédaction de dossiers de candidature pour des concours d'innovation, appels à projets Smart City / GovTech, incubateurs et partenariats institutionnels en Côte d'Ivoire (Mairies, District Autonome d'Abidjan, Ministère de l'Hydraulique, de l'Assainissement et de la Salubrité, ANAGED, ONAD, bailleurs internationaux). À partir de toutes les informations contenues dans ce document, rédige un dossier de présentation professionnel, inspirant, structuré et très persuasif pour postuler.</w:t>
+        <w:t>« Tu es un expert en rédaction de dossiers de candidature pour des compétitions d'innovation technologique, concours de startups Impact / Smart City / GovTech, incubateurs et appels à projets en Côte d'Ivoire et en Afrique. À partir de toutes les informations techniques, fonctionnelles et économiques contenues dans ce document, rédige un dossier de candidature percutant, structuré et convaincant pour le jury.</w:t>
         <w:br/>
         <w:br/>
-        <w:t>FIL CONDUCTEUR OBLIGATOIRE À METTRE EN AVANT :</w:t>
+        <w:t>POINTS CLÉS À METTRE EN AVANT :</w:t>
         <w:br/>
-        <w:t>Insiste fortement sur la philosophie centrale de notre solution : LA POLLUTION ET L'INSALUBRITÉ SONT L'AFFAIRE DE TOUS. SalubApp redonne le pouvoir d'agir à la population et permet à chaque Ivoirien de ne plus être un simple spectateur passif face à la dégradation de son cadre de vie, mais de devenir un véritable ACTEUR DE SA VILLE PROPRE, en co-responsabilité avec les autorités municipales. Combine cette vision citoyenne forte avec nos innovations technologiques de pointe (IA Gemini de classification et filtrage, floutage chirurgical 100 % automatique des visages, géolocalisation de proximité et détection intelligente des doublons). »</w:t>
+        <w:t>1. NOTRE PHILOSOPHIE CITOYENNE : La pollution et l'insalubrité sont l'affaire de tous ! SalubApp redonne le pouvoir à la population et permet à chaque Ivoirien d'être acteur de sa ville propre.</w:t>
+        <w:br/>
+        <w:t>2. L'INNOVATION IA &amp; VIE PRIVÉE : Analyse par Google Gemini Vision (filtrage anti-hors-sujet, classification automatique, floutage chirurgical 100 % automatique des visages, et détection de doublons par similitude visuelle des repères urbains + GPS).</w:t>
+        <w:br/>
+        <w:t>3. DOUBLE PLATEFORME SÉPARÉE &amp; SYNCHRONISÉE EN TEMPS RÉEL : Une interface 100 % citoyenne et un Portail Structures séparé (/dashboard) avec carte graphique/thermique des déchets et synchronisation instantanée des statuts (verrouillage automatique des votes dès qu'un problème est résolu).</w:t>
+        <w:br/>
+        <w:t>4. UN MODÈLE ÉCONOMIQUE VIABLE EN 4 PILIERS : Gratuit pour les citoyens, rentabilisé via (1) les abonnements Mairies, (2) les abonnements Opérateurs de ramassage &amp; Structures, (3) le Sponsoring RSE avec badge d'impact, et (4) la monétisation API &amp; Données Urbaines anonymisées. »</w:t>
       </w:r>
     </w:p>
     <w:p>
@@ -112,7 +120,7 @@
         <w:pStyle w:val="ListBullet"/>
       </w:pPr>
       <w:r>
-        <w:t>De spectateur à Acteur de sa Ville Propre : L'Ivoirien ne subit plus l'insalubrité ; il participe activement à l'assainissement de sa commune en signalant, en confirmant les alertes de ses voisins (+1) et en attestant de la résolution des problèmes sur le terrain.</w:t>
+        <w:t>De spectateur à Acteur de sa Ville Propre : L'Ivoirien ne subit plus l'insalubrité ; il participe activement à l'assainissement de sa commune en signalant, en confirmant les alertes de ses voisins (+1) et en suivant la résolution réelle des problèmes sur le terrain.</w:t>
       </w:r>
     </w:p>
     <w:p>
@@ -120,7 +128,7 @@
         <w:pStyle w:val="ListBullet"/>
       </w:pPr>
       <w:r>
-        <w:t>Une responsabilité partagée et constructive (Citoyens + Mairies) : SalubApp crée un pont de confiance inédit entre la population et les collectivités locales. Les citoyens orientent l'action publique grâce à la donnée de terrain, et les mairies gagnent en réactivité et en transparence.</w:t>
+        <w:t>Une responsabilité partagée et transparente (Citoyens + Structures) : SalubApp crée un pont de confiance inédit entre la population, les mairies, les ONG et les opérateurs de collecte. Les citoyens orientent l'action publique grâce à la donnée de terrain, et les structures prouvent leur efficacité.</w:t>
       </w:r>
     </w:p>
     <w:p>
@@ -128,7 +136,7 @@
         <w:pStyle w:val="ListBullet"/>
       </w:pPr>
       <w:r>
-        <w:t>Éveil de la conscience écologique et civique : En voyant en temps réel l'état de son entourage immédiat et l'impact de ses signalements, la population développe une fierté communautaire et une vigilance collective contre l'incivisme.</w:t>
+        <w:t>Gratuité totale pour la population : Pour que chaque Ivoirien puisse participer sans barrière financière, l'application citoyenne est et restera 100 % gratuite et accessible sans inscription complexe.</w:t>
       </w:r>
     </w:p>
     <w:p>
@@ -145,7 +153,7 @@
     </w:p>
     <w:p>
       <w:r>
-        <w:t>À Abidjan et dans les grandes métropoles d'Afrique francophone, la gestion de la salubrité publique et de la voirie se heurte à trois défis majeurs :</w:t>
+        <w:t>À Abidjan et dans les grandes métropoles d'Afrique francophone, la gestion de la salubrité publique et de la voirie se heurte à quatre défis majeurs :</w:t>
       </w:r>
     </w:p>
     <w:p>
@@ -161,7 +169,7 @@
         <w:pStyle w:val="ListBullet"/>
       </w:pPr>
       <w:r>
-        <w:t>La crainte de représailles ou d'exposition des données personnelles qui freine la dénonciation citoyenne de l'incivisme.</w:t>
+        <w:t>La crainte d'exposition des données personnelles qui freine le signalement citoyen.</w:t>
       </w:r>
     </w:p>
     <w:p>
@@ -169,12 +177,20 @@
         <w:pStyle w:val="ListBullet"/>
       </w:pPr>
       <w:r>
-        <w:t>Le manque de données géolocalisées en temps réel pour les mairies et opérateurs techniques (ANAGED, ONAD, SODECI, services techniques municipaux), qui doivent souvent patrouiller à l'aveugle au lieu de cibler les points noirs prioritaires.</w:t>
+        <w:t>Le manque de données géolocalisées en temps réel pour les mairies, ONG et opérateurs techniques (ANAGED, ONAD, SODECI, sociétés de pré-collecte), qui doivent souvent patrouiller à l'aveugle au lieu de cibler les points noirs prioritaires.</w:t>
+      </w:r>
+    </w:p>
+    <w:p>
+      <w:pPr>
+        <w:pStyle w:val="ListBullet"/>
+      </w:pPr>
+      <w:r>
+        <w:t>Le manque de visibilité sur les interventions effectuées : lorsqu'un problème est résolu sur le terrain, l'information n'est pas synchronisée avec la population.</w:t>
       </w:r>
     </w:p>
     <w:p>
       <w:r>
-        <w:t>SalubApp répond à cette triple problématique en offrant une plateforme web et mobile (Progressive Web App) 100 % anonyme, propulsée par l'Intelligence Artificielle multimodale et la géolocalisation de précision. En moins de 30 secondes, un citoyen photographie un problème, l'IA vérifie la pertinence de l'image, floute automatiquement les visages présents, catégorise l'incident, vérifie s'il n'a pas déjà été signalé à proximité, et transmet l'alerte sur une carte décisionnelle en temps réel destinée aux autorités municipales.</w:t>
+        <w:t>SalubApp répond à ces défis grâce à un écosystème composé de deux interfaces distinctes mais synchronisées en temps réel : une interface Citoyenne 100 % anonyme propulsée par l'Intelligence Artificielle multimodale, et un Portail dédié aux Structures (/dashboard) offrant une cartographie décisionnelle et un suivi opérationnel complet.</w:t>
       </w:r>
     </w:p>
     <w:p>
@@ -186,7 +202,7 @@
           <w:rFonts w:ascii="Calibri" w:hAnsi="Calibri"/>
           <w:color w:val="107C41"/>
         </w:rPr>
-        <w:t>3. Fonctionnalités Clés de l'Application (Volet Citoyen)</w:t>
+        <w:t>3. Innovations &amp; Fonctionnalités Clés — Plateforme Citoyenne</w:t>
       </w:r>
     </w:p>
     <w:p>
@@ -206,7 +222,7 @@
         <w:pStyle w:val="ListBullet"/>
       </w:pPr>
       <w:r>
-        <w:t>Connexion 100 % anonyme en un clic : Aucun nom, prénom, numéro de téléphone, adresse e-mail ou compte social n'est requis pour signaler, libérant totalement la parole citoyenne.</w:t>
+        <w:t>Connexion 100 % anonyme en un clic : Aucun nom, prénom, numéro de téléphone ou adresse e-mail n'est requis pour signaler.</w:t>
       </w:r>
     </w:p>
     <w:p>
@@ -214,7 +230,7 @@
         <w:pStyle w:val="ListBullet"/>
       </w:pPr>
       <w:r>
-        <w:t>Floutage Chirurgical 100 % Automatique des Visages par IA : Dès qu'une photo est prise ou importée, le moteur d'IA détecte automatiquement toutes les têtes et visages humains (même de loin, de profil ou portant un chapeau/casquette) et applique une mosaïque d'anonymisation ciblée uniquement sur les têtes, sans masquer les véhicules ni les déchets.</w:t>
+        <w:t>Floutage Chirurgical 100 % Automatique des Visages par IA : Dès qu'une photo est prise ou importée, le moteur d'IA détecte automatiquement toutes les têtes et visages humains (même de loin, de profil ou portant une casquette) et applique une mosaïque d'anonymisation ciblée uniquement sur les visages, sans masquer les déchets ni le décor.</w:t>
       </w:r>
     </w:p>
     <w:p>
@@ -222,15 +238,7 @@
         <w:pStyle w:val="ListBullet"/>
       </w:pPr>
       <w:r>
-        <w:t>Suppression automatique des métadonnées EXIF : Lors du re-encodage de l'image, toutes les métadonnées cachées de l'appareil photo (modèle du téléphone, numéro de série, horodatage interne) sont intégralement purgées.</w:t>
-      </w:r>
-    </w:p>
-    <w:p>
-      <w:pPr>
-        <w:pStyle w:val="ListBullet"/>
-      </w:pPr>
-      <w:r>
-        <w:t>Protection contre le pistage géographique : Sur la vue publique accessible aux visiteurs non connectés, les coordonnées GPS sont automatiquement arrondies au millième de degré (~110 mètres) afin qu'on ne puisse jamais identifier la fenêtre ou le domicile exact d'où la photo a été prise.</w:t>
+        <w:t>Suppression automatique des métadonnées EXIF : Lors du re-encodage de l'image, toutes les métadonnées cachées de l'appareil photo sont intégralement purgées.</w:t>
       </w:r>
     </w:p>
     <w:p>
@@ -250,7 +258,7 @@
         <w:pStyle w:val="ListBullet"/>
       </w:pPr>
       <w:r>
-        <w:t>Filtrage Strict Anti-Abus et Anti-Hors-Sujet : L'IA analyse sémantiquement chaque photo soumise. Si un utilisateur envoie une photo hors-sujet (tableau blanc, feuille de papier, cahier, selfie, intérieur de maison, écran d'ordinateur, objet quelconque), l'IA rejette immédiatement l'image avec une explication pédagogique en français.</w:t>
+        <w:t>Filtrage Strict Anti-Abus et Anti-Hors-Sujet : L'IA analyse sémantiquement chaque photo soumise. Si un utilisateur envoie une photo hors-sujet (feuille de papier, cahier, selfie, intérieur de maison, écran), l'IA rejette immédiatement l'image avec une explication en français.</w:t>
       </w:r>
     </w:p>
     <w:p>
@@ -258,7 +266,7 @@
         <w:pStyle w:val="ListBullet"/>
       </w:pPr>
       <w:r>
-        <w:t>Classification Automatique du Problème : L'IA identifie automatiquement la nature du problème parmi les 8 catégories officielles et affiche son indice de confiance (ex. : 98 % sûr).</w:t>
+        <w:t>Classification Automatique du Problème : L'IA identifie automatiquement la nature du problème parmi les 8 catégories officielles et affiche son score de confiance.</w:t>
       </w:r>
     </w:p>
     <w:p>
@@ -266,7 +274,7 @@
         <w:pStyle w:val="ListBullet"/>
       </w:pPr>
       <w:r>
-        <w:t>Rédaction Automatique de la Description : Pour faciliter l'action de tous les citoyens et garantir des rapports clairs pour la mairie, l'IA génère automatiquement une phrase descriptive précise de la scène observée.</w:t>
+        <w:t>Rédaction Automatique de la Description : L'IA génère automatiquement une phrase descriptive claire et précise en français.</w:t>
       </w:r>
     </w:p>
     <w:p>
@@ -274,7 +282,7 @@
         <w:pStyle w:val="ListBullet"/>
       </w:pPr>
       <w:r>
-        <w:t>Architecture Haute Disponibilité (Multi-Model Fallback) : Le serveur intègre un mécanisme de bascule automatique entre plusieurs modèles Gemini (Gemini 3.5 Flash Lite, Gemini 3.1 Flash Lite, Gemini 3.6 Flash) garantissant une disponibilité continue sans interruption de quota.</w:t>
+        <w:t>Architecture Haute Disponibilité (Multi-Model Fallback) : Bascule automatique entre plusieurs modèles Gemini pour garantir une continuité de service à 100 %.</w:t>
       </w:r>
     </w:p>
     <w:p>
@@ -337,7 +345,7 @@
               <w:rPr>
                 <w:b/>
               </w:rPr>
-              <w:t>Domaine d'intervention / Opérateur concerné</w:t>
+              <w:t>Acteurs / Clients potentiels concernés</w:t>
             </w:r>
           </w:p>
         </w:tc>
@@ -369,7 +377,7 @@
           </w:tcPr>
           <w:p>
             <w:r>
-              <w:t>Mairies, ANAGED, Opérateurs de collecte</w:t>
+              <w:t>Mairies, ANAGED, Opérateurs de ramassage, Sponsors RSE</w:t>
             </w:r>
           </w:p>
         </w:tc>
@@ -401,7 +409,7 @@
           </w:tcPr>
           <w:p>
             <w:r>
-              <w:t>ONAD, Mairies, Assainissement</w:t>
+              <w:t>ONAD, Mairies, Opérateurs de curage</w:t>
             </w:r>
           </w:p>
         </w:tc>
@@ -433,7 +441,7 @@
           </w:tcPr>
           <w:p>
             <w:r>
-              <w:t>AGEROUTE, District d'Abidjan, Mairies</w:t>
+              <w:t>AGEROUTE, District d'Abidjan, Mairies, Bureaux d'études</w:t>
             </w:r>
           </w:p>
         </w:tc>
@@ -465,7 +473,7 @@
           </w:tcPr>
           <w:p>
             <w:r>
-              <w:t>Assainissement, Lutte anti-vectorielle (Paludisme)</w:t>
+              <w:t>Assainissement, Bailleurs Santé (Lutte contre le paludisme)</w:t>
             </w:r>
           </w:p>
         </w:tc>
@@ -561,7 +569,7 @@
           </w:tcPr>
           <w:p>
             <w:r>
-              <w:t>SODECI, Ministère de l'Hydraulique</w:t>
+              <w:t>SODECI (via API temps réel), Ministère de l'Hydraulique</w:t>
             </w:r>
           </w:p>
         </w:tc>
@@ -609,7 +617,7 @@
           <w:rFonts w:ascii="Calibri" w:hAnsi="Calibri"/>
           <w:color w:val="107C41"/>
         </w:rPr>
-        <w:t>3.4. Géolocalisation Intelligente &amp; Priorité à l'Entourage du Citoyen</w:t>
+        <w:t>3.4. Détection Intelligente de Doublons par Similitude Visuelle IA + Localisation (+1)</w:t>
       </w:r>
     </w:p>
     <w:p>
@@ -617,7 +625,7 @@
         <w:pStyle w:val="ListBullet"/>
       </w:pPr>
       <w:r>
-        <w:t>Verrouillage sur le Périmètre du Grand Abidjan : L'application vérifie que les coordonnées GPS se trouvent bien dans le périmètre des 13 communes d'Abidjan (Abobo, Adjamé, Anyama, Attécoubé, Bingerville, Cocody, Koumassi, Marcory, Plateau, Port-Bouët, Songon, Treichville, Yopougon).</w:t>
+        <w:t>Double vérification (GPS + Similitude Visuelle IA) : Ce n'est pas parce que deux photos sont prises à 30 mètres d'écart qu'il s'agit du même signalement. SalubApp combine la proximité GPS avec une analyse visuelle comparative par Gemini Vision.</w:t>
       </w:r>
     </w:p>
     <w:p>
@@ -625,7 +633,7 @@
         <w:pStyle w:val="ListBullet"/>
       </w:pPr>
       <w:r>
-        <w:t>Tri Prioritaire par Proximité (« Autour de moi ») : À l'ouverture de l'application, la distance exacte entre le citoyen et chaque signalement est calculée via la formule géodésique de Haversine. Les signalements de l'entourage immédiat du citoyen s'affichent automatiquement en premier pour qu'il agisse directement sur son cadre de vie quotidien.</w:t>
+        <w:t>Reconnaissance des Repères Urbains : Si un dépotoir sauvage se trouve par exemple à Siporex à côté de la Pharmacie Siporex et qu'un second citoyen photographie la scène, l'IA reconnaît les mêmes éléments visuels sur l'image (la Pharmacie Siporex, le bâtiment, le tas d'ordures) associés à la même localisation.</w:t>
       </w:r>
     </w:p>
     <w:p>
@@ -633,15 +641,7 @@
         <w:pStyle w:val="ListBullet"/>
       </w:pPr>
       <w:r>
-        <w:t>Badges de Distance Dynamiques : Chaque carte de signalement indique la distance réelle par rapport à l'utilisateur (ex. : « Tout près (à 120 m) » en vert, ou « À 1.4 km »).</w:t>
-      </w:r>
-    </w:p>
-    <w:p>
-      <w:pPr>
-        <w:pStyle w:val="ListBullet"/>
-      </w:pPr>
-      <w:r>
-        <w:t>Triple Mode de Tri : L'utilisateur peut trier le fil d'actualité par « Autour de moi (les plus proches) », « Plus récents » ou « Plus confirmés (+1) ».</w:t>
+        <w:t>Consolidation Citoyenne (+1) : Une alerte interactive affiche alors la photo existante et invite le citoyen à cliquer sur « Confirmer ce problème (+1) » plutôt que de créer un doublon, faisant monter le score d'urgence du signalement.</w:t>
       </w:r>
     </w:p>
     <w:p>
@@ -653,7 +653,7 @@
           <w:rFonts w:ascii="Calibri" w:hAnsi="Calibri"/>
           <w:color w:val="107C41"/>
         </w:rPr>
-        <w:t>3.5. Détection Intelligente de Doublons par Similitude Visuelle IA &amp; Localisation (+1)</w:t>
+        <w:t>3.5. Recherche par Commune GPS &amp; Synchronisation des Statuts</w:t>
       </w:r>
     </w:p>
     <w:p>
@@ -661,7 +661,7 @@
         <w:pStyle w:val="ListBullet"/>
       </w:pPr>
       <w:r>
-        <w:t>Principe Fondamental (Localisation GPS + Similitude Visuelle par l'IA) : Dans une même rue ou à 30 mètres d'écart, il peut exister deux problèmes différents. Un vrai doublon ne se définit donc pas uniquement par une distance géographique, mais par la combinaison de la localisation et de la similitude visuelle des images.</w:t>
+        <w:t>Détection Automatique de la Commune depuis l'Image : Les coordonnées GPS de chaque signalement permettent d'identifier automatiquement la commune parmi les 13 communes d'Abidjan (Yopougon, Cocody, Abobo, Marcory, Plateau, Treichville, Koumassi, Port-Bouët, Adjamé, Attécoubé, Anyama, Bingerville, Songon).</w:t>
       </w:r>
     </w:p>
     <w:p>
@@ -669,7 +669,7 @@
         <w:pStyle w:val="ListBullet"/>
       </w:pPr>
       <w:r>
-        <w:t>Reconnaissance Visuelle des Repères Urbains par Gemini Vision : Lorsqu'un citoyen prend une photo dans une zone où un signalement actif existe déjà, l'IA compare visuellement la nouvelle photo avec les photos existantes. Par exemple, s'il y a un tas d'ordures sauvage à Siporex à côté de la Pharmacie Siporex, et que deux citoyens différents photographient la scène (même sous des angles différents), l'IA repère les éléments visuels communs (la devanture de la Pharmacie Siporex, le même décor/bâtiment et le même tas d'ordures) combinés à la même localisation GPS.</w:t>
+        <w:t>Barre de Recherche par Localité : Les citoyens peuvent rechercher instantanément tous les signalements d'une commune ou d'un quartier.</w:t>
       </w:r>
     </w:p>
     <w:p>
@@ -677,7 +677,24 @@
         <w:pStyle w:val="ListBullet"/>
       </w:pPr>
       <w:r>
-        <w:t>Alerte Interactive avec Preuve Visuelle IA : Si et seulement si l'IA confirme qu'il s'agit visuellement du même endroit et du même problème, une alerte interactive affiche la photo existante, la distance exacte et l'explication des éléments visuels reconnus par l'IA.</w:t>
+        <w:t>Verrouillage Automatique des Votes après Résolution : Dès qu'une structure marque un signalement comme « Résolu », l'information s'affiche immédiatement côté citoyen avec un bandeau vert « Problème résolu » et les boutons de vote sont automatiquement clôturés pour éviter toute confusion.</w:t>
+      </w:r>
+    </w:p>
+    <w:p>
+      <w:pPr>
+        <w:pStyle w:val="Heading1"/>
+      </w:pPr>
+      <w:r>
+        <w:rPr>
+          <w:rFonts w:ascii="Calibri" w:hAnsi="Calibri"/>
+          <w:color w:val="107C41"/>
+        </w:rPr>
+        <w:t>4. Portail Dédié et Séparé pour les Structures (/dashboard)</w:t>
+      </w:r>
+    </w:p>
+    <w:p>
+      <w:r>
+        <w:t>Pour garantir une séparation claire des usages, SalubApp dispose d'un portail exclusivement réservé aux structures (accessible sur /dashboard), totalement indépendant de l'interface citoyenne :</w:t>
       </w:r>
     </w:p>
     <w:p>
@@ -685,7 +702,7 @@
         <w:pStyle w:val="ListBullet"/>
       </w:pPr>
       <w:r>
-        <w:t>Bouton « Confirmer ce problème (+1) » : L'application invite alors le citoyen à cliquer sur « Confirmer ce problème (+1) » plutôt que de créer un doublon. Les voix des citoyens s'additionnent sur un seul et même dossier, augmentant sa priorité auprès de la mairie.</w:t>
+        <w:t>Inscription par Type de Structure : Lors de son inscription, l'organisation choisit son profil (Mairie / Collectivité locale, ONG / Association, Opérateur de salubrité, Entreprise / RSE). Une fois inscrite, elle accède à l'ensemble des données de déchets et de nuisances.</w:t>
       </w:r>
     </w:p>
     <w:p>
@@ -693,7 +710,51 @@
         <w:pStyle w:val="ListBullet"/>
       </w:pPr>
       <w:r>
-        <w:t>Liberté de Signalement : Si le citoyen photographie un autre problème distinct situé à 20 ou 30 mètres dans la même zone, l'IA voit que le décor est différent et laisse le signalement se créer normalement (ou l'utilisateur peut cliquer sur « C'est un autre endroit, continuer »).</w:t>
+        <w:t>Carte Graphique &amp; Statistiques Intégrées : Le portail offre aux structures une Carte Photos &amp; Statuts interactive, une Carte Thermique (Heatmap) d'intensité, ainsi que les graphiques de répartition par type de déchet et le classement des zones les plus touchées.</w:t>
+      </w:r>
+    </w:p>
+    <w:p>
+      <w:pPr>
+        <w:pStyle w:val="ListBullet"/>
+      </w:pPr>
+      <w:r>
+        <w:t>Tri par Score d'Urgence Citoyenne : Calcul automatique du niveau de priorité (« Urgence Critique », « Priorité Élevée », « Normale ») selon les confirmations (+1) et attestations de persistance.</w:t>
+      </w:r>
+    </w:p>
+    <w:p>
+      <w:pPr>
+        <w:pStyle w:val="ListBullet"/>
+      </w:pPr>
+      <w:r>
+        <w:t>Guidage Terrain (Google Maps) &amp; Export CSV/SIG : Bouton d'itinéraire direct vers le point GPS exact pour les équipes de ramassage et export complet des données en CSV/Excel.</w:t>
+      </w:r>
+    </w:p>
+    <w:p>
+      <w:pPr>
+        <w:pStyle w:val="ListBullet"/>
+      </w:pPr>
+      <w:r>
+        <w:t>Synchronisation Temps Réel avec la Population : Tout changement de statut (« Nouveau », « En cours », « Résolu ») effectué par une structure depuis la liste ou depuis la carte est répercuté en temps réel sur l'application des citoyens.</w:t>
+      </w:r>
+    </w:p>
+    <w:p>
+      <w:pPr>
+        <w:pStyle w:val="Heading1"/>
+      </w:pPr>
+      <w:r>
+        <w:rPr>
+          <w:rFonts w:ascii="Calibri" w:hAnsi="Calibri"/>
+          <w:color w:val="107C41"/>
+        </w:rPr>
+        <w:t>5. Modèle Économique &amp; Stratégie de Rentabilisation (Les 4 Piliers)</w:t>
+      </w:r>
+    </w:p>
+    <w:p>
+      <w:r>
+        <w:rPr>
+          <w:b/>
+        </w:rPr>
+        <w:t>Règle d'or du modèle économique : SalubApp est 100 % gratuite pour les citoyens (qui produisent la donnée et l'engagement civique) et génère des revenus récurrents auprès de 4 catégories d'acteurs économiques et institutionnels.</w:t>
       </w:r>
     </w:p>
     <w:p>
@@ -705,31 +766,12 @@
           <w:rFonts w:ascii="Calibri" w:hAnsi="Calibri"/>
           <w:color w:val="107C41"/>
         </w:rPr>
-        <w:t>3.6. Vérification Communautaire &amp; Contrôle Citoyen</w:t>
+        <w:t>Pilier 1 : Abonnements SaaS pour les Mairies &amp; Collectivités (B2G)</w:t>
       </w:r>
     </w:p>
     <w:p>
-      <w:pPr>
-        <w:pStyle w:val="ListBullet"/>
-      </w:pPr>
       <w:r>
-        <w:t>Vérification de Véracité (Vrai / Faux) : Les citoyens riverains peuvent attester de l'exactitude d'un signalement (compteurs Vrai / Faux), garantissant la fiabilité des données citoyennes.</w:t>
-      </w:r>
-    </w:p>
-    <w:p>
-      <w:pPr>
-        <w:pStyle w:val="ListBullet"/>
-      </w:pPr>
-      <w:r>
-        <w:t>Suivi de Persistance sur Place : Les riverains indiquent en temps réel si le problème est « Encore persistant » ou « Déjà résolu » sur le terrain.</w:t>
-      </w:r>
-    </w:p>
-    <w:p>
-      <w:pPr>
-        <w:pStyle w:val="ListBullet"/>
-      </w:pPr>
-      <w:r>
-        <w:t>Commentaires Citoyens Modérés : Chaque signalement dispose d'un fil de discussion permettant aux habitants d'apporter des précisions utiles aux équipes d'intervention.</w:t>
+        <w:t>Les mairies et collectivités locales souscrivent un abonnement mensuel ou annuel au Portail Structures (/dashboard) pour disposer d'un tableau de bord temps réel de la salubrité de leur commune, prioriser les interventions de leurs équipes techniques et démontrer publiquement leur réactivité aux citoyens grâce aux statuts « En cours » et « Résolu ». (Tarif indicatif : 150 000 à 500 000 FCFA / mois par commune).</w:t>
       </w:r>
     </w:p>
     <w:p>
@@ -741,7 +783,29 @@
           <w:rFonts w:ascii="Calibri" w:hAnsi="Calibri"/>
           <w:color w:val="107C41"/>
         </w:rPr>
-        <w:t>3.7. Cartographie Interactive &amp; Carte Thermique (Heatmap)</w:t>
+        <w:t>Pilier 2 : Abonnements Opérationnels pour les Opérateurs de Ramassage &amp; Structures (B2B)</w:t>
+      </w:r>
+    </w:p>
+    <w:p>
+      <w:r>
+        <w:t>Les sociétés de ramassage d'ordures, PME de pré-collecte, opérateurs de curage de caniveaux et ONG financées utilisent SalubApp pour localiser au mètre près les dépotoirs à évacuer (optimisation des tournées de camions et économie de carburant) et pour certifier leurs interventions sur le terrain auprès de leurs donneurs d'ordre. (Tarif indicatif : 100 000 à 300 000 FCFA / mois ou commission sur interventions commandées).</w:t>
+      </w:r>
+    </w:p>
+    <w:p>
+      <w:pPr>
+        <w:pStyle w:val="Heading2"/>
+      </w:pPr>
+      <w:r>
+        <w:rPr>
+          <w:rFonts w:ascii="Calibri" w:hAnsi="Calibri"/>
+          <w:color w:val="107C41"/>
+        </w:rPr>
+        <w:t>Pilier 3 : Sponsoring Entreprises &amp; Programmes RSE (B2B Impact)</w:t>
+      </w:r>
+    </w:p>
+    <w:p>
+      <w:r>
+        <w:t>Les grandes entreprises en Côte d'Ivoire (producteurs de boissons et d'eau embouteillée/sachets, opérateurs télécoms, banques, grandes surfaces, industries) financent la salubrité urbaine via 3 formats de sponsoring à forte visibilité citoyenne :</w:t>
       </w:r>
     </w:p>
     <w:p>
@@ -749,7 +813,7 @@
         <w:pStyle w:val="ListBullet"/>
       </w:pPr>
       <w:r>
-        <w:t>Carte Interactive (Leaflet / OpenStreetMap) : Visualisation de tous les points de signalement avec aperçu photo et lien d'itinéraire direct.</w:t>
+        <w:t>Le Badge d'Impact « Problème résolu grâce au soutien de [Sponsor] » : Le sponsor finance le ramassage d'un lot de dépotoirs sauvages. Sur chaque signalement nettoyé, les citoyens du quartier voient directement sur l'application que l'intervention a été financée par cette entreprise.</w:t>
       </w:r>
     </w:p>
     <w:p>
@@ -757,7 +821,7 @@
         <w:pStyle w:val="ListBullet"/>
       </w:pPr>
       <w:r>
-        <w:t>Carte Thermique des Nuisances (/carte) : Représentation visuelle des zones de concentration d'insalubrité (gradient du vert au rouge vif).</w:t>
+        <w:t>Le Sponsoring Territorial (« Commune Propre ») : Associer l'image de la marque à la carte de suivi d'une commune (ex. : « Initiative Salubrité soutenue par [Sponsor] »).</w:t>
       </w:r>
     </w:p>
     <w:p>
@@ -765,7 +829,337 @@
         <w:pStyle w:val="ListBullet"/>
       </w:pPr>
       <w:r>
-        <w:t>Statistiques Publiques en Temps Réel : Compteurs globaux (Total, En cours, Résolus), répartition par catégorie et classement du Top 5 des quartiers/communes les plus touchés.</w:t>
+        <w:t>Les Campagnes « Coup de Propre » + Rapport RSE Certifié : Financement d'opérations ciblées sur les zones rouges de la carte thermique, avec remise d'un rapport d'impact chiffré et géolocalisé pour le bilan RSE annuel du sponsor (1 000 000 à 5 000 000 FCFA par campagne).</w:t>
+      </w:r>
+    </w:p>
+    <w:p>
+      <w:pPr>
+        <w:pStyle w:val="Heading2"/>
+      </w:pPr>
+      <w:r>
+        <w:rPr>
+          <w:rFonts w:ascii="Calibri" w:hAnsi="Calibri"/>
+          <w:color w:val="107C41"/>
+        </w:rPr>
+        <w:t>Pilier 4 : API &amp; Vente de Données Urbaines Anonymisées (Data-as-a-Service)</w:t>
+      </w:r>
+    </w:p>
+    <w:p>
+      <w:r>
+        <w:t>SalubApp constitue une base de données unique en temps réel sur l'état physique de la ville (déchets, fuites d'eau, caniveaux obstrués, eaux stagnantes, dégradations de voirie). Ces données sont 100 % anonymes et conformes aux normes de protection de la vie privée (ARTCI / RGPD) grâce au floutage automatique des visages par IA.</w:t>
+      </w:r>
+    </w:p>
+    <w:p>
+      <w:pPr>
+        <w:pStyle w:val="ListBullet"/>
+      </w:pPr>
+      <w:r>
+        <w:t>Licence API Temps Réel pour les Concessionnaires Publics (SODECI, CIE, ANAGED, ONAD) : Connexion directe par API (JSON / GeoJSON) permettant par exemple à la SODECI de recevoir automatiquement dans son système chaque fuite d'eau signalée et validée par l'IA avec photo et point GPS exact (300 000 à 1 000 000 FCFA / mois).</w:t>
+      </w:r>
+    </w:p>
+    <w:p>
+      <w:pPr>
+        <w:pStyle w:val="ListBullet"/>
+      </w:pPr>
+      <w:r>
+        <w:t>Vente de Jeux de Données (Datasets) aux Bureaux d'Études (Urbanisme, BTP, Environnement) : Cartographie historique des zones inondables, des caniveaux bouchés et de la voirie dégradée pour les études d'impact et projets d'infrastructures (500 000 à 2 000 000 FCFA par étude).</w:t>
+      </w:r>
+    </w:p>
+    <w:p>
+      <w:pPr>
+        <w:pStyle w:val="ListBullet"/>
+      </w:pPr>
+      <w:r>
+        <w:t>Observatoire Urbain pour les Bailleurs Internationaux (Banque Mondiale, AFD, PNUD, ONU-Habitat) : Accès API et rapports analytiques permettant de cibler les investissements d'assainissement et de lutte contre le paludisme/inondations (2 000 000 à 10 000 000 FCFA / an).</w:t>
+      </w:r>
+    </w:p>
+    <w:tbl>
+      <w:tblPr>
+        <w:tblStyle w:val="TableGrid"/>
+        <w:tblW w:type="auto" w:w="0"/>
+        <w:jc w:val="center"/>
+        <w:tblLook w:firstColumn="1" w:firstRow="1" w:lastColumn="0" w:lastRow="0" w:noHBand="0" w:noVBand="1" w:val="04A0"/>
+      </w:tblPr>
+      <w:tblGrid>
+        <w:gridCol w:w="2160"/>
+        <w:gridCol w:w="2160"/>
+        <w:gridCol w:w="2160"/>
+        <w:gridCol w:w="2160"/>
+      </w:tblGrid>
+      <w:tr>
+        <w:tc>
+          <w:tcPr>
+            <w:tcW w:type="dxa" w:w="2160"/>
+          </w:tcPr>
+          <w:p>
+            <w:r>
+              <w:rPr>
+                <w:b/>
+              </w:rPr>
+              <w:t>Pilier de Revenu</w:t>
+            </w:r>
+          </w:p>
+        </w:tc>
+        <w:tc>
+          <w:tcPr>
+            <w:tcW w:type="dxa" w:w="2160"/>
+          </w:tcPr>
+          <w:p>
+            <w:r>
+              <w:rPr>
+                <w:b/>
+              </w:rPr>
+              <w:t>Clients Cibles</w:t>
+            </w:r>
+          </w:p>
+        </w:tc>
+        <w:tc>
+          <w:tcPr>
+            <w:tcW w:type="dxa" w:w="2160"/>
+          </w:tcPr>
+          <w:p>
+            <w:r>
+              <w:rPr>
+                <w:b/>
+              </w:rPr>
+              <w:t>Proposition de Valeur</w:t>
+            </w:r>
+          </w:p>
+        </w:tc>
+        <w:tc>
+          <w:tcPr>
+            <w:tcW w:type="dxa" w:w="2160"/>
+          </w:tcPr>
+          <w:p>
+            <w:r>
+              <w:rPr>
+                <w:b/>
+              </w:rPr>
+              <w:t>Tarification Indicative</w:t>
+            </w:r>
+          </w:p>
+        </w:tc>
+      </w:tr>
+      <w:tr>
+        <w:tc>
+          <w:tcPr>
+            <w:tcW w:type="dxa" w:w="2160"/>
+          </w:tcPr>
+          <w:p>
+            <w:r>
+              <w:t>1. Mairies &amp; Collectivités</w:t>
+            </w:r>
+          </w:p>
+        </w:tc>
+        <w:tc>
+          <w:tcPr>
+            <w:tcW w:type="dxa" w:w="2160"/>
+          </w:tcPr>
+          <w:p>
+            <w:r>
+              <w:t>Mairies des 13 communes d'Abidjan &amp; villes de l'intérieur</w:t>
+            </w:r>
+          </w:p>
+        </w:tc>
+        <w:tc>
+          <w:tcPr>
+            <w:tcW w:type="dxa" w:w="2160"/>
+          </w:tcPr>
+          <w:p>
+            <w:r>
+              <w:t>Portail de suivi, carte thermique, priorisation &amp; preuve d'action</w:t>
+            </w:r>
+          </w:p>
+        </w:tc>
+        <w:tc>
+          <w:tcPr>
+            <w:tcW w:type="dxa" w:w="2160"/>
+          </w:tcPr>
+          <w:p>
+            <w:r>
+              <w:t>150 000 – 500 000 FCFA / mois / commune</w:t>
+            </w:r>
+          </w:p>
+        </w:tc>
+      </w:tr>
+      <w:tr>
+        <w:tc>
+          <w:tcPr>
+            <w:tcW w:type="dxa" w:w="2160"/>
+          </w:tcPr>
+          <w:p>
+            <w:r>
+              <w:t>2. Opérateurs &amp; Structures</w:t>
+            </w:r>
+          </w:p>
+        </w:tc>
+        <w:tc>
+          <w:tcPr>
+            <w:tcW w:type="dxa" w:w="2160"/>
+          </w:tcPr>
+          <w:p>
+            <w:r>
+              <w:t>Sociétés de ramassage, PME de pré-collecte, curage, ONG</w:t>
+            </w:r>
+          </w:p>
+        </w:tc>
+        <w:tc>
+          <w:tcPr>
+            <w:tcW w:type="dxa" w:w="2160"/>
+          </w:tcPr>
+          <w:p>
+            <w:r>
+              <w:t>Coordonnées GPS exactes, itinéraires camions &amp; suivi d'intervention</w:t>
+            </w:r>
+          </w:p>
+        </w:tc>
+        <w:tc>
+          <w:tcPr>
+            <w:tcW w:type="dxa" w:w="2160"/>
+          </w:tcPr>
+          <w:p>
+            <w:r>
+              <w:t>100 000 – 300 000 FCFA / mois</w:t>
+            </w:r>
+          </w:p>
+        </w:tc>
+      </w:tr>
+      <w:tr>
+        <w:tc>
+          <w:tcPr>
+            <w:tcW w:type="dxa" w:w="2160"/>
+          </w:tcPr>
+          <w:p>
+            <w:r>
+              <w:t>3. Sponsoring RSE</w:t>
+            </w:r>
+          </w:p>
+        </w:tc>
+        <w:tc>
+          <w:tcPr>
+            <w:tcW w:type="dxa" w:w="2160"/>
+          </w:tcPr>
+          <w:p>
+            <w:r>
+              <w:t>Marques de boissons, Télécoms, Banques, Grandes surfaces</w:t>
+            </w:r>
+          </w:p>
+        </w:tc>
+        <w:tc>
+          <w:tcPr>
+            <w:tcW w:type="dxa" w:w="2160"/>
+          </w:tcPr>
+          <w:p>
+            <w:r>
+              <w:t>Badge « Résolu grâce à [Sponsor] », campagnes &amp; Rapport RSE certifié</w:t>
+            </w:r>
+          </w:p>
+        </w:tc>
+        <w:tc>
+          <w:tcPr>
+            <w:tcW w:type="dxa" w:w="2160"/>
+          </w:tcPr>
+          <w:p>
+            <w:r>
+              <w:t>1 000 000 – 5 000 000 FCFA / campagne</w:t>
+            </w:r>
+          </w:p>
+        </w:tc>
+      </w:tr>
+      <w:tr>
+        <w:tc>
+          <w:tcPr>
+            <w:tcW w:type="dxa" w:w="2160"/>
+          </w:tcPr>
+          <w:p>
+            <w:r>
+              <w:t>4. API &amp; Vente de Données</w:t>
+            </w:r>
+          </w:p>
+        </w:tc>
+        <w:tc>
+          <w:tcPr>
+            <w:tcW w:type="dxa" w:w="2160"/>
+          </w:tcPr>
+          <w:p>
+            <w:r>
+              <w:t>SODECI, ANAGED, ONAD, Bureaux d'études BTP, Bailleurs</w:t>
+            </w:r>
+          </w:p>
+        </w:tc>
+        <w:tc>
+          <w:tcPr>
+            <w:tcW w:type="dxa" w:w="2160"/>
+          </w:tcPr>
+          <w:p>
+            <w:r>
+              <w:t>Flux API temps réel (GeoJSON) &amp; études de données urbaines anonymisées</w:t>
+            </w:r>
+          </w:p>
+        </w:tc>
+        <w:tc>
+          <w:tcPr>
+            <w:tcW w:type="dxa" w:w="2160"/>
+          </w:tcPr>
+          <w:p>
+            <w:r>
+              <w:t>300 000 – 1 000 000 FCFA / mois ou par étude</w:t>
+            </w:r>
+          </w:p>
+        </w:tc>
+      </w:tr>
+    </w:tbl>
+    <w:p/>
+    <w:p>
+      <w:pPr>
+        <w:pStyle w:val="Heading1"/>
+      </w:pPr>
+      <w:r>
+        <w:rPr>
+          <w:rFonts w:ascii="Calibri" w:hAnsi="Calibri"/>
+          <w:color w:val="107C41"/>
+        </w:rPr>
+        <w:t>6. Architecture Technique &amp; Sécurité des Données</w:t>
+      </w:r>
+    </w:p>
+    <w:p>
+      <w:pPr>
+        <w:pStyle w:val="ListBullet"/>
+      </w:pPr>
+      <w:r>
+        <w:t>Frontend &amp; Framework Full-Stack : React 19, TypeScript, Vite, TanStack Start (SSR) &amp; TanStack Router, Tailwind CSS et composants accessibles Shadcn UI.</w:t>
+      </w:r>
+    </w:p>
+    <w:p>
+      <w:pPr>
+        <w:pStyle w:val="ListBullet"/>
+      </w:pPr>
+      <w:r>
+        <w:t>Cartographie Décisionnelle : Leaflet, React-Leaflet et Leaflet.heat pour le rendu haute performance des cartes photos et cartes thermiques.</w:t>
+      </w:r>
+    </w:p>
+    <w:p>
+      <w:pPr>
+        <w:pStyle w:val="ListBullet"/>
+      </w:pPr>
+      <w:r>
+        <w:t>Backend &amp; Base de Données : Supabase (PostgreSQL) avec politiques de sécurité Row-Level Security (RLS) et synchronisation temps réel des statuts.</w:t>
+      </w:r>
+    </w:p>
+    <w:p>
+      <w:pPr>
+        <w:pStyle w:val="ListBullet"/>
+      </w:pPr>
+      <w:r>
+        <w:t>Intelligence Artificielle : API Google Gemini Vision exécutée côté serveur (Server Functions) pour la classification, le floutage automatique des visages et la détection visuelle de doublons.</w:t>
+      </w:r>
+    </w:p>
+    <w:p>
+      <w:pPr>
+        <w:pStyle w:val="ListBullet"/>
+      </w:pPr>
+      <w:r>
+        <w:t>Infrastructure &amp; Déploiement Continu (CI/CD) : Dépôt GitHub et déploiement automatisé sur le réseau mondial Vercel Edge.</w:t>
       </w:r>
     </w:p>
     <w:p>
@@ -777,7 +1171,7 @@
           <w:rFonts w:ascii="Calibri" w:hAnsi="Calibri"/>
           <w:color w:val="107C41"/>
         </w:rPr>
-        <w:t>4. Portail Unifié pour les Structures (Mairies, ONG, Associations &amp; Opérateurs)</w:t>
+        <w:t>7. Impacts Sociaux, Sanitaires et Économiques (Arguments Clés pour le Jury)</w:t>
       </w:r>
     </w:p>
     <w:p>
@@ -785,7 +1179,7 @@
         <w:pStyle w:val="ListBullet"/>
       </w:pPr>
       <w:r>
-        <w:t>Inscription Dédiée des Structures (/login?mode=structure) : Toute structure engagée dans l'assainissement peut s'inscrire sur la plateforme en renseignant son nom et en choisissant son type de structure parmi : Mairie / Collectivité locale, ONG / Association citoyenne, Opérateur technique de salubrité, Entreprise privée / Programme RSE, ou Autre institution.</w:t>
+        <w:t>Révolution Citoyenne (« L'Ivoirien Acteur de sa Ville Propre ») : La lutte contre la pollution devient participative. Chaque citoyen dispose du pouvoir d'améliorer concrètement la propreté de sa rue.</w:t>
       </w:r>
     </w:p>
     <w:p>
@@ -793,7 +1187,7 @@
         <w:pStyle w:val="ListBullet"/>
       </w:pPr>
       <w:r>
-        <w:t>Accès Unifié et Égalitaire aux Données de Déchets (/dashboard) : Dès son inscription validée, peu importe le type de structure choisi (Mairie, ONG, Association…), l'organisation accède à l'intégralité des mêmes données de déchets et de signalements citoyens à travers toute la ville.</w:t>
+        <w:t>Impact Sanitaire et Environnemental Majeur : Élimination ciblée des dépotoirs sauvages, des eaux stagnantes et des caniveaux bouchés, réduisant directement le paludisme, les maladies hydriques et les risques d'inondations en saison des pluies.</w:t>
       </w:r>
     </w:p>
     <w:p>
@@ -801,7 +1195,7 @@
         <w:pStyle w:val="ListBullet"/>
       </w:pPr>
       <w:r>
-        <w:t>Priorisation Automatique par Score d'Urgence Citoyenne : Chaque signalement reçoit un badge d'urgence automatique (« Urgence Critique », « Priorité Élevée », « Normale ») calculé à partir du nombre de confirmations citoyennes (+1), des votes « Vrai » et des attestations « Encore persistant ».</w:t>
+        <w:t>Optimisation des Ressources Publiques et Privées : Les mairies, les opérateurs de ramassage et les sponsors RSE concentrent leurs budgets exactement là où les citoyens confirment l'urgence.</w:t>
       </w:r>
     </w:p>
     <w:p>
@@ -809,135 +1203,7 @@
         <w:pStyle w:val="ListBullet"/>
       </w:pPr>
       <w:r>
-        <w:t>Filtrage par Commune GPS &amp; Recherche de Localité : Les structures peuvent filtrer les données en un clic par commune d'Abidjan (détectée automatiquement via les coordonnées GPS envoyées avec chaque image) ou par catégorie de déchet/nuisance.</w:t>
-      </w:r>
-    </w:p>
-    <w:p>
-      <w:pPr>
-        <w:pStyle w:val="ListBullet"/>
-      </w:pPr>
-      <w:r>
-        <w:t>Bouton « Itinéraire Terrain (Google Maps) » : Sur chaque fiche de signalement, un bouton lance directement la navigation GPS vers le point exact du tas d'ordures ou de la dégradation pour guider les camions de ramassage et les équipes d'intervention.</w:t>
-      </w:r>
-    </w:p>
-    <w:p>
-      <w:pPr>
-        <w:pStyle w:val="ListBullet"/>
-      </w:pPr>
-      <w:r>
-        <w:t>Suivi du Statut d'Intervention &amp; Export CSV/Excel : Mise à jour en temps réel du statut (« Nouveau » -&gt; « En cours » -&gt; « Résolu ») et téléchargement complet de la base de données en CSV/Excel avec coordonnées GPS exactes et niveaux d'urgence.</w:t>
-      </w:r>
-    </w:p>
-    <w:p>
-      <w:pPr>
-        <w:pStyle w:val="ListBullet"/>
-      </w:pPr>
-      <w:r>
-        <w:t>Console de Super-Administration (/administrator_app) : Certification des signalements (« Vérifié », « Douteux », « Rejeté »), modération des commentaires citoyens, consultation des avis utilisateurs et gestion des rôles.</w:t>
-      </w:r>
-    </w:p>
-    <w:p>
-      <w:pPr>
-        <w:pStyle w:val="Heading1"/>
-      </w:pPr>
-      <w:r>
-        <w:rPr>
-          <w:rFonts w:ascii="Calibri" w:hAnsi="Calibri"/>
-          <w:color w:val="107C41"/>
-        </w:rPr>
-        <w:t>5. Architecture Technique &amp; Sécurité des Données</w:t>
-      </w:r>
-    </w:p>
-    <w:p>
-      <w:pPr>
-        <w:pStyle w:val="ListBullet"/>
-      </w:pPr>
-      <w:r>
-        <w:t>Frontend &amp; Framework Full-Stack : React 19, TypeScript, Vite, TanStack Start (SSR) &amp; TanStack Router, Tailwind CSS et composants accessibles Shadcn UI / Radix.</w:t>
-      </w:r>
-    </w:p>
-    <w:p>
-      <w:pPr>
-        <w:pStyle w:val="ListBullet"/>
-      </w:pPr>
-      <w:r>
-        <w:t>Cartographie : Leaflet, React-Leaflet et Leaflet.heat pour le rendu haute performance des cartes de chaleur.</w:t>
-      </w:r>
-    </w:p>
-    <w:p>
-      <w:pPr>
-        <w:pStyle w:val="ListBullet"/>
-      </w:pPr>
-      <w:r>
-        <w:t>Backend &amp; Base de Données : Supabase (PostgreSQL) avec politiques de sécurité au niveau des lignes (Row-Level Security - RLS) garantissant que seuls les utilisateurs autorisés peuvent modifier les statuts.</w:t>
-      </w:r>
-    </w:p>
-    <w:p>
-      <w:pPr>
-        <w:pStyle w:val="ListBullet"/>
-      </w:pPr>
-      <w:r>
-        <w:t>Stockage Cloud : Bucket sécurisé pour les photos de signalements préalablement anonymisées.</w:t>
-      </w:r>
-    </w:p>
-    <w:p>
-      <w:pPr>
-        <w:pStyle w:val="ListBullet"/>
-      </w:pPr>
-      <w:r>
-        <w:t>Intelligence Artificielle : API Google Gemini (Vision multimodale) exécutée côté serveur (Server Functions) pour protéger les clés d'API.</w:t>
-      </w:r>
-    </w:p>
-    <w:p>
-      <w:pPr>
-        <w:pStyle w:val="ListBullet"/>
-      </w:pPr>
-      <w:r>
-        <w:t>Infrastructure &amp; Déploiement Continu (CI/CD) : Code source indépendant sur GitHub et déploiement automatisé sur le réseau mondial Vercel Edge.</w:t>
-      </w:r>
-    </w:p>
-    <w:p>
-      <w:pPr>
-        <w:pStyle w:val="Heading1"/>
-      </w:pPr>
-      <w:r>
-        <w:rPr>
-          <w:rFonts w:ascii="Calibri" w:hAnsi="Calibri"/>
-          <w:color w:val="107C41"/>
-        </w:rPr>
-        <w:t>6. Impacts Sociaux, Citoyens, Sanitaires et Économiques (Arguments Clés)</w:t>
-      </w:r>
-    </w:p>
-    <w:p>
-      <w:pPr>
-        <w:pStyle w:val="ListBullet"/>
-      </w:pPr>
-      <w:r>
-        <w:t>Révolution Citoyenne (« L'Ivoirien Acteur de sa Ville Propre ») : La lutte contre la pollution devient une démarche participative et inclusive. Chaque citoyen dispose enfin du pouvoir d'améliorer concrètement la propreté de sa rue et de sa commune.</w:t>
-      </w:r>
-    </w:p>
-    <w:p>
-      <w:pPr>
-        <w:pStyle w:val="ListBullet"/>
-      </w:pPr>
-      <w:r>
-        <w:t>Impact Sanitaire Majeur : Réduction rapide des dépotoirs sauvages, des eaux stagnantes et des caniveaux bouchés, diminuant directement la prolifération du paludisme, des maladies hydriques et les risques d'inondations meurtrières en saison des pluies à Abidjan.</w:t>
-      </w:r>
-    </w:p>
-    <w:p>
-      <w:pPr>
-        <w:pStyle w:val="ListBullet"/>
-      </w:pPr>
-      <w:r>
-        <w:t>Optimisation des Budgets Municipaux : Grâce au tri par confirmations citoyennes (+1) et à la carte thermique, les mairies et l'ANAGED déploient leurs équipes exactement là où l'urgence est avérée, réduisant les coûts de carburant et de patrouille.</w:t>
-      </w:r>
-    </w:p>
-    <w:p>
-      <w:pPr>
-        <w:pStyle w:val="ListBullet"/>
-      </w:pPr>
-      <w:r>
-        <w:t>Scalabilité Nationale et Sous-Régionale : Déjà opérationnelle sur les 13 communes d'Abidjan, l'architecture de SalubApp peut être déployée immédiatement dans toutes les communes de Côte d'Ivoire (Bouaké, Yamoussoukro, San-Pédro, Korhogo, Daloa) et en Afrique de l'Ouest.</w:t>
+        <w:t>Scalabilité Nationale et Sous-Régionale : Déjà opérationnelle sur les 13 communes d'Abidjan, SalubApp est prête à être déployée dans toutes les villes de Côte d'Ivoire (Bouaké, Yamoussoukro, San-Pédro, Korhogo, Daloa) et en Afrique de l'Ouest.</w:t>
       </w:r>
     </w:p>
     <w:sectPr>

</xml_diff>